<commit_message>
Update network analysis outputs
</commit_message>
<xml_diff>
--- a/QHM6706-Supervision_log_template.docx
+++ b/QHM6706-Supervision_log_template.docx
@@ -101,9 +101,9 @@
         <w:tblLook w:val="04A0" w:firstRow="1" w:lastRow="0" w:firstColumn="1" w:lastColumn="0" w:noHBand="0" w:noVBand="1"/>
       </w:tblPr>
       <w:tblGrid>
-        <w:gridCol w:w="1496"/>
-        <w:gridCol w:w="1397"/>
-        <w:gridCol w:w="1500"/>
+        <w:gridCol w:w="1501"/>
+        <w:gridCol w:w="1391"/>
+        <w:gridCol w:w="1501"/>
         <w:gridCol w:w="1686"/>
         <w:gridCol w:w="1043"/>
         <w:gridCol w:w="1894"/>
@@ -162,7 +162,7 @@
               <w:rPr>
                 <w:rFonts w:ascii="Times New Roman" w:hAnsi="Times New Roman" w:cs="Times New Roman"/>
               </w:rPr>
-              <w:t>International School</w:t>
+              <w:t>Queen Mary School Hainan</w:t>
             </w:r>
           </w:p>
         </w:tc>
@@ -368,14 +368,12 @@
                 <w:rFonts w:ascii="Times New Roman" w:hAnsi="Times New Roman" w:cs="Times New Roman"/>
               </w:rPr>
             </w:pPr>
-            <w:proofErr w:type="spellStart"/>
             <w:r>
               <w:rPr>
                 <w:rFonts w:ascii="Times New Roman" w:hAnsi="Times New Roman" w:cs="Times New Roman" w:hint="eastAsia"/>
               </w:rPr>
               <w:t>Mingqi</w:t>
             </w:r>
-            <w:proofErr w:type="spellEnd"/>
           </w:p>
         </w:tc>
       </w:tr>
@@ -963,12 +961,10 @@
           <w:p>
             <w:pPr>
               <w:rPr>
-                <w:rFonts w:ascii="Times New Roman" w:hAnsi="Times New Roman" w:cs="Times New Roman" w:hint="eastAsia"/>
+                <w:rFonts w:ascii="Times New Roman" w:hAnsi="Times New Roman" w:cs="Times New Roman"/>
                 <w:color w:val="000000"/>
               </w:rPr>
             </w:pPr>
-            <w:proofErr w:type="spellStart"/>
-            <w:proofErr w:type="gramStart"/>
             <w:r>
               <w:rPr>
                 <w:rFonts w:ascii="Times New Roman" w:hAnsi="Times New Roman" w:cs="Times New Roman"/>
@@ -979,15 +975,7 @@
               <w:rPr>
                 <w:rFonts w:ascii="Times New Roman" w:hAnsi="Times New Roman" w:cs="Times New Roman" w:hint="eastAsia"/>
               </w:rPr>
-              <w:t>discus</w:t>
-            </w:r>
-            <w:proofErr w:type="spellEnd"/>
-            <w:proofErr w:type="gramEnd"/>
-            <w:r>
-              <w:rPr>
-                <w:rFonts w:ascii="Times New Roman" w:hAnsi="Times New Roman" w:cs="Times New Roman" w:hint="eastAsia"/>
-              </w:rPr>
-              <w:t xml:space="preserve"> about the </w:t>
+              <w:t xml:space="preserve">discus about the </w:t>
             </w:r>
             <w:r>
               <w:rPr>
@@ -1017,7 +1005,6 @@
               </w:rPr>
               <w:t xml:space="preserve"> </w:t>
             </w:r>
-            <w:proofErr w:type="spellStart"/>
             <w:r>
               <w:rPr>
                 <w:rFonts w:ascii="Times New Roman" w:hAnsi="Times New Roman" w:cs="Times New Roman"/>
@@ -1025,7 +1012,6 @@
               </w:rPr>
               <w:t>Specification_Report_Student_Template</w:t>
             </w:r>
-            <w:proofErr w:type="spellEnd"/>
             <w:r>
               <w:rPr>
                 <w:rFonts w:ascii="Times New Roman" w:hAnsi="Times New Roman" w:cs="Times New Roman" w:hint="eastAsia"/>
@@ -1037,51 +1023,306 @@
           <w:p>
             <w:pPr>
               <w:rPr>
-                <w:rFonts w:ascii="Times New Roman" w:hAnsi="Times New Roman" w:cs="Times New Roman" w:hint="eastAsia"/>
-              </w:rPr>
-            </w:pPr>
-          </w:p>
-          <w:p>
-            <w:pPr>
-              <w:rPr>
-                <w:rFonts w:ascii="Times New Roman" w:hAnsi="Times New Roman" w:cs="Times New Roman"/>
-              </w:rPr>
-            </w:pPr>
-          </w:p>
-          <w:p>
-            <w:pPr>
-              <w:rPr>
-                <w:rFonts w:ascii="Times New Roman" w:hAnsi="Times New Roman" w:cs="Times New Roman"/>
-              </w:rPr>
-            </w:pPr>
-          </w:p>
-          <w:p>
-            <w:pPr>
-              <w:rPr>
-                <w:rFonts w:ascii="Times New Roman" w:hAnsi="Times New Roman" w:cs="Times New Roman"/>
-              </w:rPr>
-            </w:pPr>
-          </w:p>
-          <w:p>
-            <w:pPr>
-              <w:rPr>
-                <w:rFonts w:ascii="Times New Roman" w:hAnsi="Times New Roman" w:cs="Times New Roman"/>
-              </w:rPr>
-            </w:pPr>
-          </w:p>
-          <w:p>
-            <w:pPr>
-              <w:rPr>
-                <w:rFonts w:ascii="Times New Roman" w:hAnsi="Times New Roman" w:cs="Times New Roman"/>
-              </w:rPr>
-            </w:pPr>
-          </w:p>
-          <w:p>
-            <w:pPr>
-              <w:rPr>
-                <w:rFonts w:ascii="Times New Roman" w:hAnsi="Times New Roman" w:cs="Times New Roman"/>
-              </w:rPr>
-            </w:pPr>
+                <w:rFonts w:ascii="Times New Roman" w:hAnsi="Times New Roman" w:cs="Times New Roman"/>
+              </w:rPr>
+            </w:pPr>
+          </w:p>
+          <w:p>
+            <w:pPr>
+              <w:rPr>
+                <w:rFonts w:ascii="Times New Roman" w:hAnsi="Times New Roman" w:cs="Times New Roman"/>
+              </w:rPr>
+            </w:pPr>
+            <w:r>
+              <w:rPr>
+                <w:rFonts w:ascii="Times New Roman" w:hAnsi="Times New Roman" w:cs="Times New Roman"/>
+              </w:rPr>
+              <w:t>Date:</w:t>
+            </w:r>
+            <w:r>
+              <w:rPr>
+                <w:rFonts w:ascii="Times New Roman" w:hAnsi="Times New Roman" w:cs="Times New Roman" w:hint="eastAsia"/>
+              </w:rPr>
+              <w:t>12</w:t>
+            </w:r>
+            <w:r>
+              <w:rPr>
+                <w:rFonts w:ascii="Times New Roman" w:hAnsi="Times New Roman" w:cs="Times New Roman"/>
+              </w:rPr>
+              <w:t>-1</w:t>
+            </w:r>
+            <w:r>
+              <w:rPr>
+                <w:rFonts w:ascii="Times New Roman" w:hAnsi="Times New Roman" w:cs="Times New Roman" w:hint="eastAsia"/>
+              </w:rPr>
+              <w:t>1</w:t>
+            </w:r>
+            <w:r>
+              <w:rPr>
+                <w:rFonts w:ascii="Times New Roman" w:hAnsi="Times New Roman" w:cs="Times New Roman"/>
+              </w:rPr>
+              <w:t>-2025</w:t>
+            </w:r>
+          </w:p>
+          <w:p>
+            <w:pPr>
+              <w:rPr>
+                <w:rFonts w:ascii="Times New Roman" w:hAnsi="Times New Roman" w:cs="Times New Roman"/>
+              </w:rPr>
+            </w:pPr>
+            <w:r>
+              <w:rPr>
+                <w:rFonts w:ascii="Times New Roman" w:hAnsi="Times New Roman" w:cs="Times New Roman"/>
+              </w:rPr>
+              <w:t>Supervision type: online meeting</w:t>
+            </w:r>
+          </w:p>
+          <w:p>
+            <w:pPr>
+              <w:rPr>
+                <w:rFonts w:ascii="Times New Roman" w:hAnsi="Times New Roman" w:cs="Times New Roman"/>
+              </w:rPr>
+            </w:pPr>
+            <w:r>
+              <w:rPr>
+                <w:rFonts w:ascii="Times New Roman" w:hAnsi="Times New Roman" w:cs="Times New Roman"/>
+              </w:rPr>
+              <w:t>Summary</w:t>
+            </w:r>
+            <w:r>
+              <w:rPr>
+                <w:rFonts w:ascii="Times New Roman" w:hAnsi="Times New Roman" w:cs="Times New Roman" w:hint="eastAsia"/>
+              </w:rPr>
+              <w:t>：</w:t>
+            </w:r>
+            <w:r>
+              <w:rPr>
+                <w:rFonts w:ascii="Times New Roman" w:hAnsi="Times New Roman" w:cs="Times New Roman" w:hint="eastAsia"/>
+              </w:rPr>
+              <w:t>discus about the work plan</w:t>
+            </w:r>
+            <w:r>
+              <w:rPr>
+                <w:rFonts w:ascii="Times New Roman" w:hAnsi="Times New Roman" w:cs="Times New Roman" w:hint="eastAsia"/>
+              </w:rPr>
+              <w:t xml:space="preserve"> finish the final </w:t>
+            </w:r>
+            <w:r>
+              <w:rPr>
+                <w:rFonts w:ascii="Times New Roman" w:hAnsi="Times New Roman" w:cs="Times New Roman"/>
+                <w:color w:val="000000"/>
+              </w:rPr>
+              <w:t>Specification_Report_Student_Template</w:t>
+            </w:r>
+          </w:p>
+          <w:p>
+            <w:pPr>
+              <w:rPr>
+                <w:rFonts w:ascii="Times New Roman" w:hAnsi="Times New Roman" w:cs="Times New Roman"/>
+              </w:rPr>
+            </w:pPr>
+          </w:p>
+          <w:p>
+            <w:pPr>
+              <w:rPr>
+                <w:rFonts w:ascii="Times New Roman" w:hAnsi="Times New Roman" w:cs="Times New Roman"/>
+              </w:rPr>
+            </w:pPr>
+            <w:r>
+              <w:rPr>
+                <w:rFonts w:ascii="Times New Roman" w:hAnsi="Times New Roman" w:cs="Times New Roman"/>
+              </w:rPr>
+              <w:t>Date:</w:t>
+            </w:r>
+            <w:r>
+              <w:rPr>
+                <w:rFonts w:ascii="Times New Roman" w:hAnsi="Times New Roman" w:cs="Times New Roman" w:hint="eastAsia"/>
+              </w:rPr>
+              <w:t>26</w:t>
+            </w:r>
+            <w:r>
+              <w:rPr>
+                <w:rFonts w:ascii="Times New Roman" w:hAnsi="Times New Roman" w:cs="Times New Roman"/>
+              </w:rPr>
+              <w:t>-1</w:t>
+            </w:r>
+            <w:r>
+              <w:rPr>
+                <w:rFonts w:ascii="Times New Roman" w:hAnsi="Times New Roman" w:cs="Times New Roman" w:hint="eastAsia"/>
+              </w:rPr>
+              <w:t>1</w:t>
+            </w:r>
+            <w:r>
+              <w:rPr>
+                <w:rFonts w:ascii="Times New Roman" w:hAnsi="Times New Roman" w:cs="Times New Roman"/>
+              </w:rPr>
+              <w:t>-2025</w:t>
+            </w:r>
+          </w:p>
+          <w:p>
+            <w:pPr>
+              <w:rPr>
+                <w:rFonts w:ascii="Times New Roman" w:hAnsi="Times New Roman" w:cs="Times New Roman"/>
+              </w:rPr>
+            </w:pPr>
+            <w:r>
+              <w:rPr>
+                <w:rFonts w:ascii="Times New Roman" w:hAnsi="Times New Roman" w:cs="Times New Roman"/>
+              </w:rPr>
+              <w:t>Supervision type: online meeting</w:t>
+            </w:r>
+          </w:p>
+          <w:p>
+            <w:pPr>
+              <w:rPr>
+                <w:rFonts w:ascii="Times New Roman" w:hAnsi="Times New Roman" w:cs="Times New Roman"/>
+              </w:rPr>
+            </w:pPr>
+            <w:r>
+              <w:rPr>
+                <w:rFonts w:ascii="Times New Roman" w:hAnsi="Times New Roman" w:cs="Times New Roman"/>
+              </w:rPr>
+              <w:t>Summary</w:t>
+            </w:r>
+            <w:r>
+              <w:rPr>
+                <w:rFonts w:ascii="Times New Roman" w:hAnsi="Times New Roman" w:cs="Times New Roman" w:hint="eastAsia"/>
+              </w:rPr>
+              <w:t>：</w:t>
+            </w:r>
+            <w:r>
+              <w:rPr>
+                <w:rFonts w:ascii="Times New Roman" w:hAnsi="Times New Roman" w:cs="Times New Roman"/>
+              </w:rPr>
+              <w:t>Discussed the Early_Term-Progress_Seport_Template about the project</w:t>
+            </w:r>
+          </w:p>
+          <w:p>
+            <w:pPr>
+              <w:rPr>
+                <w:rFonts w:ascii="Times New Roman" w:hAnsi="Times New Roman" w:cs="Times New Roman"/>
+              </w:rPr>
+            </w:pPr>
+          </w:p>
+          <w:p>
+            <w:pPr>
+              <w:rPr>
+                <w:rFonts w:ascii="Times New Roman" w:hAnsi="Times New Roman" w:cs="Times New Roman"/>
+              </w:rPr>
+            </w:pPr>
+          </w:p>
+          <w:p>
+            <w:pPr>
+              <w:rPr>
+                <w:rFonts w:ascii="Times New Roman" w:hAnsi="Times New Roman" w:cs="Times New Roman"/>
+              </w:rPr>
+            </w:pPr>
+            <w:r>
+              <w:rPr>
+                <w:rFonts w:ascii="Times New Roman" w:hAnsi="Times New Roman" w:cs="Times New Roman"/>
+              </w:rPr>
+              <w:t>Date:</w:t>
+            </w:r>
+            <w:r>
+              <w:rPr>
+                <w:rFonts w:ascii="Times New Roman" w:hAnsi="Times New Roman" w:cs="Times New Roman" w:hint="eastAsia"/>
+              </w:rPr>
+              <w:t>10</w:t>
+            </w:r>
+            <w:r>
+              <w:rPr>
+                <w:rFonts w:ascii="Times New Roman" w:hAnsi="Times New Roman" w:cs="Times New Roman"/>
+              </w:rPr>
+              <w:t>-1</w:t>
+            </w:r>
+            <w:r>
+              <w:rPr>
+                <w:rFonts w:ascii="Times New Roman" w:hAnsi="Times New Roman" w:cs="Times New Roman" w:hint="eastAsia"/>
+              </w:rPr>
+              <w:t>2</w:t>
+            </w:r>
+            <w:r>
+              <w:rPr>
+                <w:rFonts w:ascii="Times New Roman" w:hAnsi="Times New Roman" w:cs="Times New Roman"/>
+              </w:rPr>
+              <w:t>-2025</w:t>
+            </w:r>
+          </w:p>
+          <w:p>
+            <w:pPr>
+              <w:rPr>
+                <w:rFonts w:ascii="Times New Roman" w:hAnsi="Times New Roman" w:cs="Times New Roman"/>
+              </w:rPr>
+            </w:pPr>
+            <w:r>
+              <w:rPr>
+                <w:rFonts w:ascii="Times New Roman" w:hAnsi="Times New Roman" w:cs="Times New Roman"/>
+              </w:rPr>
+              <w:t>Supervision type: online meeting</w:t>
+            </w:r>
+          </w:p>
+          <w:p>
+            <w:pPr>
+              <w:rPr>
+                <w:rFonts w:ascii="Times New Roman" w:hAnsi="Times New Roman" w:cs="Times New Roman"/>
+              </w:rPr>
+            </w:pPr>
+            <w:r>
+              <w:rPr>
+                <w:rFonts w:ascii="Times New Roman" w:hAnsi="Times New Roman" w:cs="Times New Roman"/>
+              </w:rPr>
+              <w:t>Summary</w:t>
+            </w:r>
+            <w:r>
+              <w:rPr>
+                <w:rFonts w:ascii="Times New Roman" w:hAnsi="Times New Roman" w:cs="Times New Roman" w:hint="eastAsia"/>
+              </w:rPr>
+              <w:t>：</w:t>
+            </w:r>
+          </w:p>
+          <w:p>
+            <w:pPr>
+              <w:rPr>
+                <w:rFonts w:ascii="Times New Roman" w:hAnsi="Times New Roman" w:cs="Times New Roman"/>
+              </w:rPr>
+            </w:pPr>
+          </w:p>
+          <w:p>
+            <w:pPr>
+              <w:rPr>
+                <w:rFonts w:ascii="Times New Roman" w:hAnsi="Times New Roman" w:cs="Times New Roman"/>
+              </w:rPr>
+            </w:pPr>
+            <w:r>
+              <w:rPr>
+                <w:rFonts w:ascii="Times New Roman" w:hAnsi="Times New Roman" w:cs="Times New Roman"/>
+              </w:rPr>
+              <w:t>Date:</w:t>
+            </w:r>
+            <w:r>
+              <w:rPr>
+                <w:rFonts w:ascii="Times New Roman" w:hAnsi="Times New Roman" w:cs="Times New Roman" w:hint="eastAsia"/>
+              </w:rPr>
+              <w:t>27</w:t>
+            </w:r>
+            <w:r>
+              <w:rPr>
+                <w:rFonts w:ascii="Times New Roman" w:hAnsi="Times New Roman" w:cs="Times New Roman"/>
+              </w:rPr>
+              <w:t>-1</w:t>
+            </w:r>
+            <w:r>
+              <w:rPr>
+                <w:rFonts w:ascii="Times New Roman" w:hAnsi="Times New Roman" w:cs="Times New Roman" w:hint="eastAsia"/>
+              </w:rPr>
+              <w:t>2</w:t>
+            </w:r>
+            <w:r>
+              <w:rPr>
+                <w:rFonts w:ascii="Times New Roman" w:hAnsi="Times New Roman" w:cs="Times New Roman"/>
+              </w:rPr>
+              <w:t>-2025</w:t>
+            </w:r>
           </w:p>
           <w:p>
             <w:pPr>
@@ -1695,6 +1936,7 @@
   <w:style w:type="character" w:default="1" w:styleId="a0">
     <w:name w:val="Default Paragraph Font"/>
     <w:uiPriority w:val="1"/>
+    <w:semiHidden/>
     <w:unhideWhenUsed/>
   </w:style>
   <w:style w:type="table" w:default="1" w:styleId="a1">
@@ -2060,6 +2302,66 @@
 </file>
 
 <file path=customXml/item1.xml><?xml version="1.0" encoding="utf-8"?>
+<p:properties xmlns:p="http://schemas.microsoft.com/office/2006/metadata/properties" xmlns:xsi="http://www.w3.org/2001/XMLSchema-instance" xmlns:pc="http://schemas.microsoft.com/office/infopath/2007/PartnerControls">
+  <documentManagement>
+    <QMULInformationClassificationTaxHTField0 xmlns="http://schemas.microsoft.com/sharepoint/v3">
+      <Terms xmlns="http://schemas.microsoft.com/office/infopath/2007/PartnerControls">
+        <TermInfo xmlns="http://schemas.microsoft.com/office/infopath/2007/PartnerControls">
+          <TermName xmlns="http://schemas.microsoft.com/office/infopath/2007/PartnerControls">Protect</TermName>
+          <TermId xmlns="http://schemas.microsoft.com/office/infopath/2007/PartnerControls">9124d8d9-0c1c-41e9-aa14-aba001e9a028</TermId>
+        </TermInfo>
+      </Terms>
+    </QMULInformationClassificationTaxHTField0>
+    <Form xmlns="ad1b7021-3cc8-42a8-966a-1a70eaf3b65a" xsi:nil="true"/>
+    <QMULSchoolTaxHTField0 xmlns="http://schemas.microsoft.com/sharepoint/v3">
+      <Terms xmlns="http://schemas.microsoft.com/office/infopath/2007/PartnerControls"/>
+    </QMULSchoolTaxHTField0>
+    <QMULDocumentTypeTaxHTField0 xmlns="http://schemas.microsoft.com/sharepoint/v3">
+      <Terms xmlns="http://schemas.microsoft.com/office/infopath/2007/PartnerControls"/>
+    </QMULDocumentTypeTaxHTField0>
+    <QMULReviewDate xmlns="http://schemas.microsoft.com/sharepoint/v3" xsi:nil="true"/>
+    <TaxKeywordTaxHTField xmlns="ac047116-60af-4843-8a0c-1daee2e3446c">
+      <Terms xmlns="http://schemas.microsoft.com/office/infopath/2007/PartnerControls">
+        <TermInfo xmlns="http://schemas.microsoft.com/office/infopath/2007/PartnerControls">
+          <TermName xmlns="http://schemas.microsoft.com/office/infopath/2007/PartnerControls">supervision log</TermName>
+          <TermId xmlns="http://schemas.microsoft.com/office/infopath/2007/PartnerControls">f421cf73-f872-40f2-aea6-b3b1aeadfcfb</TermId>
+        </TermInfo>
+      </Terms>
+    </TaxKeywordTaxHTField>
+    <QMULOwner xmlns="http://schemas.microsoft.com/sharepoint/v3">
+      <UserInfo>
+        <DisplayName/>
+        <AccountId xsi:nil="true"/>
+        <AccountType/>
+      </UserInfo>
+    </QMULOwner>
+    <TaxCatchAll xmlns="ac047116-60af-4843-8a0c-1daee2e3446c">
+      <Value>25</Value>
+      <Value>3</Value>
+    </TaxCatchAll>
+    <lcf76f155ced4ddcb4097134ff3c332f xmlns="ad1b7021-3cc8-42a8-966a-1a70eaf3b65a">
+      <Terms xmlns="http://schemas.microsoft.com/office/infopath/2007/PartnerControls"/>
+    </lcf76f155ced4ddcb4097134ff3c332f>
+    <QMULDepartmentTaxHTField0 xmlns="http://schemas.microsoft.com/sharepoint/v3">
+      <Terms xmlns="http://schemas.microsoft.com/office/infopath/2007/PartnerControls"/>
+    </QMULDepartmentTaxHTField0>
+    <QMULAcademicYear xmlns="http://schemas.microsoft.com/sharepoint/v3" xsi:nil="true"/>
+    <QMULLocationTaxHTField0 xmlns="http://schemas.microsoft.com/sharepoint/v3">
+      <Terms xmlns="http://schemas.microsoft.com/office/infopath/2007/PartnerControls"/>
+    </QMULLocationTaxHTField0>
+    <QMULDocumentStatusTaxHTField0 xmlns="http://schemas.microsoft.com/sharepoint/v3">
+      <Terms xmlns="http://schemas.microsoft.com/office/infopath/2007/PartnerControls"/>
+    </QMULDocumentStatusTaxHTField0>
+    <QMULProject xmlns="http://schemas.microsoft.com/sharepoint/v3" xsi:nil="true"/>
+  </documentManagement>
+</p:properties>
+</file>
+
+<file path=customXml/item2.xml><?xml version="1.0" encoding="utf-8"?>
+<b:Sources xmlns:b="http://schemas.openxmlformats.org/officeDocument/2006/bibliography" xmlns="http://schemas.openxmlformats.org/officeDocument/2006/bibliography" SelectedStyle="\APASixthEditionOfficeOnline.xsl" StyleName="APA" Version="6"/>
+</file>
+
+<file path=customXml/item3.xml><?xml version="1.0" encoding="utf-8"?>
 <?mso-contentType ?>
 <FormTemplates xmlns="http://schemas.microsoft.com/sharepoint/v3/contenttype/forms">
   <Display>DocumentLibraryForm</Display>
@@ -2068,7 +2370,7 @@
 </FormTemplates>
 </file>
 
-<file path=customXml/item2.xml><?xml version="1.0" encoding="utf-8"?>
+<file path=customXml/item4.xml><?xml version="1.0" encoding="utf-8"?>
 <ct:contentTypeSchema xmlns:ct="http://schemas.microsoft.com/office/2006/metadata/contentType" xmlns:ma="http://schemas.microsoft.com/office/2006/metadata/properties/metaAttributes" ct:_="" ma:_="" ma:contentTypeName="QMUL Document" ma:contentTypeID="0x0101005EA864BF41DF8A41860E925F5B29BCF500AB016A62E9E9C0479C83212DC66541E4" ma:contentTypeVersion="38" ma:contentTypeDescription="" ma:contentTypeScope="" ma:versionID="afd9db63b996a4c51c215b03f4209c2f">
   <xsd:schema xmlns:xsd="http://www.w3.org/2001/XMLSchema" xmlns:xs="http://www.w3.org/2001/XMLSchema" xmlns:p="http://schemas.microsoft.com/office/2006/metadata/properties" xmlns:ns1="http://schemas.microsoft.com/sharepoint/v3" xmlns:ns2="ac047116-60af-4843-8a0c-1daee2e3446c" xmlns:ns3="ad1b7021-3cc8-42a8-966a-1a70eaf3b65a" targetNamespace="http://schemas.microsoft.com/office/2006/metadata/properties" ma:root="true" ma:fieldsID="b4512b13da26723f09751248ead08c4b" ns1:_="" ns2:_="" ns3:_="">
     <xsd:import namespace="http://schemas.microsoft.com/sharepoint/v3"/>
@@ -2427,67 +2729,27 @@
 </ct:contentTypeSchema>
 </file>
 
-<file path=customXml/item3.xml><?xml version="1.0" encoding="utf-8"?>
-<p:properties xmlns:p="http://schemas.microsoft.com/office/2006/metadata/properties" xmlns:xsi="http://www.w3.org/2001/XMLSchema-instance" xmlns:pc="http://schemas.microsoft.com/office/infopath/2007/PartnerControls">
-  <documentManagement>
-    <QMULInformationClassificationTaxHTField0 xmlns="http://schemas.microsoft.com/sharepoint/v3">
-      <Terms xmlns="http://schemas.microsoft.com/office/infopath/2007/PartnerControls">
-        <TermInfo xmlns="http://schemas.microsoft.com/office/infopath/2007/PartnerControls">
-          <TermName xmlns="http://schemas.microsoft.com/office/infopath/2007/PartnerControls">Protect</TermName>
-          <TermId xmlns="http://schemas.microsoft.com/office/infopath/2007/PartnerControls">9124d8d9-0c1c-41e9-aa14-aba001e9a028</TermId>
-        </TermInfo>
-      </Terms>
-    </QMULInformationClassificationTaxHTField0>
-    <Form xmlns="ad1b7021-3cc8-42a8-966a-1a70eaf3b65a" xsi:nil="true"/>
-    <QMULSchoolTaxHTField0 xmlns="http://schemas.microsoft.com/sharepoint/v3">
-      <Terms xmlns="http://schemas.microsoft.com/office/infopath/2007/PartnerControls"/>
-    </QMULSchoolTaxHTField0>
-    <QMULDocumentTypeTaxHTField0 xmlns="http://schemas.microsoft.com/sharepoint/v3">
-      <Terms xmlns="http://schemas.microsoft.com/office/infopath/2007/PartnerControls"/>
-    </QMULDocumentTypeTaxHTField0>
-    <QMULReviewDate xmlns="http://schemas.microsoft.com/sharepoint/v3" xsi:nil="true"/>
-    <TaxKeywordTaxHTField xmlns="ac047116-60af-4843-8a0c-1daee2e3446c">
-      <Terms xmlns="http://schemas.microsoft.com/office/infopath/2007/PartnerControls">
-        <TermInfo xmlns="http://schemas.microsoft.com/office/infopath/2007/PartnerControls">
-          <TermName xmlns="http://schemas.microsoft.com/office/infopath/2007/PartnerControls">supervision log</TermName>
-          <TermId xmlns="http://schemas.microsoft.com/office/infopath/2007/PartnerControls">f421cf73-f872-40f2-aea6-b3b1aeadfcfb</TermId>
-        </TermInfo>
-      </Terms>
-    </TaxKeywordTaxHTField>
-    <QMULOwner xmlns="http://schemas.microsoft.com/sharepoint/v3">
-      <UserInfo>
-        <DisplayName/>
-        <AccountId xsi:nil="true"/>
-        <AccountType/>
-      </UserInfo>
-    </QMULOwner>
-    <TaxCatchAll xmlns="ac047116-60af-4843-8a0c-1daee2e3446c">
-      <Value>25</Value>
-      <Value>3</Value>
-    </TaxCatchAll>
-    <lcf76f155ced4ddcb4097134ff3c332f xmlns="ad1b7021-3cc8-42a8-966a-1a70eaf3b65a">
-      <Terms xmlns="http://schemas.microsoft.com/office/infopath/2007/PartnerControls"/>
-    </lcf76f155ced4ddcb4097134ff3c332f>
-    <QMULDepartmentTaxHTField0 xmlns="http://schemas.microsoft.com/sharepoint/v3">
-      <Terms xmlns="http://schemas.microsoft.com/office/infopath/2007/PartnerControls"/>
-    </QMULDepartmentTaxHTField0>
-    <QMULAcademicYear xmlns="http://schemas.microsoft.com/sharepoint/v3" xsi:nil="true"/>
-    <QMULLocationTaxHTField0 xmlns="http://schemas.microsoft.com/sharepoint/v3">
-      <Terms xmlns="http://schemas.microsoft.com/office/infopath/2007/PartnerControls"/>
-    </QMULLocationTaxHTField0>
-    <QMULDocumentStatusTaxHTField0 xmlns="http://schemas.microsoft.com/sharepoint/v3">
-      <Terms xmlns="http://schemas.microsoft.com/office/infopath/2007/PartnerControls"/>
-    </QMULDocumentStatusTaxHTField0>
-    <QMULProject xmlns="http://schemas.microsoft.com/sharepoint/v3" xsi:nil="true"/>
-  </documentManagement>
-</p:properties>
+<file path=customXml/itemProps1.xml><?xml version="1.0" encoding="utf-8"?>
+<ds:datastoreItem xmlns:ds="http://schemas.openxmlformats.org/officeDocument/2006/customXml" ds:itemID="{84D2A0A7-5CC5-4D94-BFEC-67D95788A223}">
+  <ds:schemaRefs>
+    <ds:schemaRef ds:uri="http://schemas.microsoft.com/office/2006/metadata/properties"/>
+    <ds:schemaRef ds:uri="http://schemas.microsoft.com/office/infopath/2007/PartnerControls"/>
+    <ds:schemaRef ds:uri="http://schemas.microsoft.com/sharepoint/v3"/>
+    <ds:schemaRef ds:uri="ad1b7021-3cc8-42a8-966a-1a70eaf3b65a"/>
+    <ds:schemaRef ds:uri="ac047116-60af-4843-8a0c-1daee2e3446c"/>
+  </ds:schemaRefs>
+</ds:datastoreItem>
 </file>
 
-<file path=customXml/item4.xml><?xml version="1.0" encoding="utf-8"?>
-<b:Sources xmlns:b="http://schemas.openxmlformats.org/officeDocument/2006/bibliography" xmlns="http://schemas.openxmlformats.org/officeDocument/2006/bibliography" SelectedStyle="\APASixthEditionOfficeOnline.xsl" StyleName="APA" Version="6"/>
+<file path=customXml/itemProps2.xml><?xml version="1.0" encoding="utf-8"?>
+<ds:datastoreItem xmlns:ds="http://schemas.openxmlformats.org/officeDocument/2006/customXml" ds:itemID="{45579525-5C51-4F70-A954-17ECE715FB99}">
+  <ds:schemaRefs>
+    <ds:schemaRef ds:uri="http://schemas.openxmlformats.org/officeDocument/2006/bibliography"/>
+  </ds:schemaRefs>
+</ds:datastoreItem>
 </file>
 
-<file path=customXml/itemProps1.xml><?xml version="1.0" encoding="utf-8"?>
+<file path=customXml/itemProps3.xml><?xml version="1.0" encoding="utf-8"?>
 <ds:datastoreItem xmlns:ds="http://schemas.openxmlformats.org/officeDocument/2006/customXml" ds:itemID="{F12EF910-F447-49BA-A000-4FC81D3C5AC2}">
   <ds:schemaRefs>
     <ds:schemaRef ds:uri="http://schemas.microsoft.com/sharepoint/v3/contenttype/forms"/>
@@ -2495,7 +2757,7 @@
 </ds:datastoreItem>
 </file>
 
-<file path=customXml/itemProps2.xml><?xml version="1.0" encoding="utf-8"?>
+<file path=customXml/itemProps4.xml><?xml version="1.0" encoding="utf-8"?>
 <ds:datastoreItem xmlns:ds="http://schemas.openxmlformats.org/officeDocument/2006/customXml" ds:itemID="{A18A3AC4-DE48-43DE-9075-A26C3F710820}">
   <ds:schemaRefs>
     <ds:schemaRef ds:uri="http://schemas.microsoft.com/office/2006/metadata/contentType"/>
@@ -2513,24 +2775,4 @@
     <ds:schemaRef ds:uri="http://schemas.microsoft.com/internal/obd"/>
   </ds:schemaRefs>
 </ds:datastoreItem>
-</file>
-
-<file path=customXml/itemProps3.xml><?xml version="1.0" encoding="utf-8"?>
-<ds:datastoreItem xmlns:ds="http://schemas.openxmlformats.org/officeDocument/2006/customXml" ds:itemID="{84D2A0A7-5CC5-4D94-BFEC-67D95788A223}">
-  <ds:schemaRefs>
-    <ds:schemaRef ds:uri="http://schemas.microsoft.com/office/2006/metadata/properties"/>
-    <ds:schemaRef ds:uri="http://schemas.microsoft.com/office/infopath/2007/PartnerControls"/>
-    <ds:schemaRef ds:uri="http://schemas.microsoft.com/sharepoint/v3"/>
-    <ds:schemaRef ds:uri="ad1b7021-3cc8-42a8-966a-1a70eaf3b65a"/>
-    <ds:schemaRef ds:uri="ac047116-60af-4843-8a0c-1daee2e3446c"/>
-  </ds:schemaRefs>
-</ds:datastoreItem>
-</file>
-
-<file path=customXml/itemProps4.xml><?xml version="1.0" encoding="utf-8"?>
-<ds:datastoreItem xmlns:ds="http://schemas.openxmlformats.org/officeDocument/2006/customXml" ds:itemID="{45579525-5C51-4F70-A954-17ECE715FB99}">
-  <ds:schemaRefs>
-    <ds:schemaRef ds:uri="http://schemas.openxmlformats.org/officeDocument/2006/bibliography"/>
-  </ds:schemaRefs>
-</ds:datastoreItem>
 </file>
</xml_diff>